<commit_message>
Wireframe and Documentaito Nimprovements
</commit_message>
<xml_diff>
--- a/Task1_DesignDocs_DesignProposal_LL-000020924_Gallagher_J.docx
+++ b/Task1_DesignDocs_DesignProposal_LL-000020924_Gallagher_J.docx
@@ -1,6 +1,6 @@
 
 <file path=word/document.xml><?xml version="1.0" encoding="utf-8"?>
-<w:document xmlns:wpc="http://schemas.microsoft.com/office/word/2010/wordprocessingCanvas" xmlns:cx="http://schemas.microsoft.com/office/drawing/2014/chartex" xmlns:cx1="http://schemas.microsoft.com/office/drawing/2015/9/8/chartex" xmlns:cx2="http://schemas.microsoft.com/office/drawing/2015/10/21/chartex" xmlns:cx3="http://schemas.microsoft.com/office/drawing/2016/5/9/chartex" xmlns:cx4="http://schemas.microsoft.com/office/drawing/2016/5/10/chartex" xmlns:cx5="http://schemas.microsoft.com/office/drawing/2016/5/11/chartex" xmlns:cx6="http://schemas.microsoft.com/office/drawing/2016/5/12/chartex" xmlns:cx7="http://schemas.microsoft.com/office/drawing/2016/5/13/chartex" xmlns:cx8="http://schemas.microsoft.com/office/drawing/2016/5/14/chartex" xmlns:mc="http://schemas.openxmlformats.org/markup-compatibility/2006" xmlns:aink="http://schemas.microsoft.com/office/drawing/2016/ink" xmlns:am3d="http://schemas.microsoft.com/office/drawing/2017/model3d" xmlns:o="urn:schemas-microsoft-com:office:office" xmlns:r="http://schemas.openxmlformats.org/officeDocument/2006/relationships" xmlns:m="http://schemas.openxmlformats.org/officeDocument/2006/math" xmlns:v="urn:schemas-microsoft-com:vml" xmlns:wp14="http://schemas.microsoft.com/office/word/2010/wordprocessingDrawing" xmlns:wp="http://schemas.openxmlformats.org/drawingml/2006/wordprocessingDrawing" xmlns:w10="urn:schemas-microsoft-com:office:word" xmlns:w="http://schemas.openxmlformats.org/wordprocessingml/2006/main" xmlns:w14="http://schemas.microsoft.com/office/word/2010/wordml" xmlns:w15="http://schemas.microsoft.com/office/word/2012/wordml" xmlns:w16cex="http://schemas.microsoft.com/office/word/2018/wordml/cex" xmlns:w16cid="http://schemas.microsoft.com/office/word/2016/wordml/cid" xmlns:w16="http://schemas.microsoft.com/office/word/2018/wordml" xmlns:w16sdtdh="http://schemas.microsoft.com/office/word/2020/wordml/sdtdatahash" xmlns:w16se="http://schemas.microsoft.com/office/word/2015/wordml/symex" xmlns:wpg="http://schemas.microsoft.com/office/word/2010/wordprocessingGroup" xmlns:wpi="http://schemas.microsoft.com/office/word/2010/wordprocessingInk" xmlns:wne="http://schemas.microsoft.com/office/word/2006/wordml" xmlns:wps="http://schemas.microsoft.com/office/word/2010/wordprocessingShape" mc:Ignorable="w14 w15 w16se w16cid w16 w16cex w16sdtdh wp14">
+<w:document xmlns:wpc="http://schemas.microsoft.com/office/word/2010/wordprocessingCanvas" xmlns:cx="http://schemas.microsoft.com/office/drawing/2014/chartex" xmlns:cx1="http://schemas.microsoft.com/office/drawing/2015/9/8/chartex" xmlns:cx2="http://schemas.microsoft.com/office/drawing/2015/10/21/chartex" xmlns:cx3="http://schemas.microsoft.com/office/drawing/2016/5/9/chartex" xmlns:cx4="http://schemas.microsoft.com/office/drawing/2016/5/10/chartex" xmlns:cx5="http://schemas.microsoft.com/office/drawing/2016/5/11/chartex" xmlns:cx6="http://schemas.microsoft.com/office/drawing/2016/5/12/chartex" xmlns:cx7="http://schemas.microsoft.com/office/drawing/2016/5/13/chartex" xmlns:cx8="http://schemas.microsoft.com/office/drawing/2016/5/14/chartex" xmlns:mc="http://schemas.openxmlformats.org/markup-compatibility/2006" xmlns:aink="http://schemas.microsoft.com/office/drawing/2016/ink" xmlns:am3d="http://schemas.microsoft.com/office/drawing/2017/model3d" xmlns:o="urn:schemas-microsoft-com:office:office" xmlns:oel="http://schemas.microsoft.com/office/2019/extlst" xmlns:r="http://schemas.openxmlformats.org/officeDocument/2006/relationships" xmlns:m="http://schemas.openxmlformats.org/officeDocument/2006/math" xmlns:v="urn:schemas-microsoft-com:vml" xmlns:wp14="http://schemas.microsoft.com/office/word/2010/wordprocessingDrawing" xmlns:wp="http://schemas.openxmlformats.org/drawingml/2006/wordprocessingDrawing" xmlns:w10="urn:schemas-microsoft-com:office:word" xmlns:w="http://schemas.openxmlformats.org/wordprocessingml/2006/main" xmlns:w14="http://schemas.microsoft.com/office/word/2010/wordml" xmlns:w15="http://schemas.microsoft.com/office/word/2012/wordml" xmlns:w16cex="http://schemas.microsoft.com/office/word/2018/wordml/cex" xmlns:w16cid="http://schemas.microsoft.com/office/word/2016/wordml/cid" xmlns:w16="http://schemas.microsoft.com/office/word/2018/wordml" xmlns:w16du="http://schemas.microsoft.com/office/word/2023/wordml/word16du" xmlns:w16sdtdh="http://schemas.microsoft.com/office/word/2020/wordml/sdtdatahash" xmlns:w16sdtfl="http://schemas.microsoft.com/office/word/2024/wordml/sdtformatlock" xmlns:w16se="http://schemas.microsoft.com/office/word/2015/wordml/symex" xmlns:wpg="http://schemas.microsoft.com/office/word/2010/wordprocessingGroup" xmlns:wpi="http://schemas.microsoft.com/office/word/2010/wordprocessingInk" xmlns:wne="http://schemas.microsoft.com/office/word/2006/wordml" xmlns:wps="http://schemas.microsoft.com/office/word/2010/wordprocessingShape" mc:Ignorable="w14 w15 w16se w16cid w16 w16cex w16sdtdh w16sdtfl w16du wp14">
   <w:body>
     <w:p>
       <w:pPr>
@@ -41,13 +41,8 @@
         </w:numPr>
       </w:pPr>
       <w:r>
-        <w:t xml:space="preserve">What is this document about and what will it </w:t>
-      </w:r>
-      <w:proofErr w:type="gramStart"/>
-      <w:r>
-        <w:t>include</w:t>
-      </w:r>
-      <w:proofErr w:type="gramEnd"/>
+        <w:t>What is this document about and what will it include</w:t>
+      </w:r>
     </w:p>
     <w:p>
       <w:pPr>
@@ -143,6 +138,70 @@
     </w:p>
     <w:p>
       <w:pPr>
+        <w:pStyle w:val="Heading2"/>
+      </w:pPr>
+      <w:r>
+        <w:t>Sitemap</w:t>
+      </w:r>
+    </w:p>
+    <w:p/>
+    <w:p>
+      <w:r>
+        <w:rPr>
+          <w:noProof/>
+        </w:rPr>
+        <w:drawing>
+          <wp:inline distT="0" distB="0" distL="0" distR="0" wp14:anchorId="4CB6D3CB" wp14:editId="47A0A0AC">
+            <wp:extent cx="5731510" cy="1598295"/>
+            <wp:effectExtent l="0" t="0" r="2540" b="1905"/>
+            <wp:docPr id="741731248" name="Picture 3"/>
+            <wp:cNvGraphicFramePr>
+              <a:graphicFrameLocks xmlns:a="http://schemas.openxmlformats.org/drawingml/2006/main" noChangeAspect="1"/>
+            </wp:cNvGraphicFramePr>
+            <a:graphic xmlns:a="http://schemas.openxmlformats.org/drawingml/2006/main">
+              <a:graphicData uri="http://schemas.openxmlformats.org/drawingml/2006/picture">
+                <pic:pic xmlns:pic="http://schemas.openxmlformats.org/drawingml/2006/picture">
+                  <pic:nvPicPr>
+                    <pic:cNvPr id="0" name="Picture 7"/>
+                    <pic:cNvPicPr>
+                      <a:picLocks noChangeAspect="1" noChangeArrowheads="1"/>
+                    </pic:cNvPicPr>
+                  </pic:nvPicPr>
+                  <pic:blipFill>
+                    <a:blip r:embed="rId8" cstate="print">
+                      <a:extLst>
+                        <a:ext uri="{28A0092B-C50C-407E-A947-70E740481C1C}">
+                          <a14:useLocalDpi xmlns:a14="http://schemas.microsoft.com/office/drawing/2010/main" val="0"/>
+                        </a:ext>
+                      </a:extLst>
+                    </a:blip>
+                    <a:srcRect/>
+                    <a:stretch>
+                      <a:fillRect/>
+                    </a:stretch>
+                  </pic:blipFill>
+                  <pic:spPr bwMode="auto">
+                    <a:xfrm>
+                      <a:off x="0" y="0"/>
+                      <a:ext cx="5731510" cy="1598295"/>
+                    </a:xfrm>
+                    <a:prstGeom prst="rect">
+                      <a:avLst/>
+                    </a:prstGeom>
+                    <a:noFill/>
+                    <a:ln>
+                      <a:noFill/>
+                    </a:ln>
+                  </pic:spPr>
+                </pic:pic>
+              </a:graphicData>
+            </a:graphic>
+          </wp:inline>
+        </w:drawing>
+      </w:r>
+    </w:p>
+    <w:p>
+      <w:pPr>
         <w:pStyle w:val="Heading1"/>
       </w:pPr>
       <w:r>
@@ -164,6 +223,9 @@
     </w:p>
     <w:p>
       <w:r>
+        <w:rPr>
+          <w:noProof/>
+        </w:rPr>
         <w:drawing>
           <wp:inline distT="0" distB="0" distL="0" distR="0" wp14:anchorId="38E7669B" wp14:editId="3133719B">
             <wp:extent cx="6180579" cy="1884459"/>
@@ -180,7 +242,7 @@
                     <pic:cNvPicPr/>
                   </pic:nvPicPr>
                   <pic:blipFill>
-                    <a:blip r:embed="rId8"/>
+                    <a:blip r:embed="rId9"/>
                     <a:stretch>
                       <a:fillRect/>
                     </a:stretch>
@@ -238,7 +300,7 @@
                     </pic:cNvPicPr>
                   </pic:nvPicPr>
                   <pic:blipFill>
-                    <a:blip r:embed="rId9">
+                    <a:blip r:embed="rId10">
                       <a:extLst>
                         <a:ext uri="{28A0092B-C50C-407E-A947-70E740481C1C}">
                           <a14:useLocalDpi xmlns:a14="http://schemas.microsoft.com/office/drawing/2010/main" val="0"/>
@@ -299,7 +361,15 @@
       </w:r>
       <w:proofErr w:type="gramEnd"/>
       <w:r>
-        <w:t xml:space="preserve"> service and will be submit the users data to the database, then taking them to the landing page</w:t>
+        <w:t xml:space="preserve"> service and will be submit the </w:t>
+      </w:r>
+      <w:proofErr w:type="gramStart"/>
+      <w:r>
+        <w:t>users</w:t>
+      </w:r>
+      <w:proofErr w:type="gramEnd"/>
+      <w:r>
+        <w:t xml:space="preserve"> data to the database, then taking them to the landing page</w:t>
       </w:r>
       <w:r>
         <w:t xml:space="preserve"> and completing the function</w:t>
@@ -381,7 +451,7 @@
                     </pic:cNvPicPr>
                   </pic:nvPicPr>
                   <pic:blipFill>
-                    <a:blip r:embed="rId10">
+                    <a:blip r:embed="rId11">
                       <a:extLst>
                         <a:ext uri="{28A0092B-C50C-407E-A947-70E740481C1C}">
                           <a14:useLocalDpi xmlns:a14="http://schemas.microsoft.com/office/drawing/2010/main" val="0"/>
@@ -414,6 +484,37 @@
       </w:r>
     </w:p>
     <w:p>
+      <w:r>
+        <w:lastRenderedPageBreak/>
+        <w:t xml:space="preserve">The login function starts by using GET method which allows web content to be displayed to the user. Once the login form is displayed to the user, we need to know if the user clicked forgot password or not. If the user did click forgot password, a password reset will be sent to the email. </w:t>
+      </w:r>
+      <w:r>
+        <w:t xml:space="preserve">If the user clicked register, they will be taken to the register page and the function will again end. </w:t>
+      </w:r>
+      <w:r>
+        <w:t xml:space="preserve">Otherwise, the user will need to input their login credentials, POST method will then be used to submit the form. </w:t>
+      </w:r>
+      <w:r>
+        <w:t>Making use of the Users database, the email and password will be validated to see if they match with a user from the Users database. If it isn’t then the user will be displayed with an adequate error message display what they did wrong. Otherwise, the user will be logged in to their account and taken to the landing page, ending the function.</w:t>
+      </w:r>
+    </w:p>
+    <w:p/>
+    <w:p>
+      <w:pPr>
+        <w:rPr>
+          <w:b/>
+          <w:bCs/>
+        </w:rPr>
+      </w:pPr>
+      <w:r>
+        <w:rPr>
+          <w:b/>
+          <w:bCs/>
+        </w:rPr>
+        <w:t>Calculating and applying Loyalty Points:</w:t>
+      </w:r>
+    </w:p>
+    <w:p>
       <w:pPr>
         <w:rPr>
           <w:i/>
@@ -421,17 +522,248 @@
         </w:rPr>
       </w:pPr>
       <w:r>
+        <w:rPr>
+          <w:noProof/>
+        </w:rPr>
         <w:lastRenderedPageBreak/>
-        <w:t xml:space="preserve">The login function starts by using GET method which allows web content to be displayed to the user. Once the login form is displayed to the user, we need to know if the user clicked forgot password or not. If the user did click forgot password, a password reset will be sent to the email. </w:t>
-      </w:r>
-      <w:r>
-        <w:t xml:space="preserve">If the user clicked register, they will be taken to the register page and the function will again end. </w:t>
-      </w:r>
-      <w:r>
-        <w:t xml:space="preserve">Otherwise, the user will need to input their login credentials, POST method will then be used to submit the form. </w:t>
-      </w:r>
-      <w:r>
-        <w:t>Making use of the Users database, the email and password will be validated to see if they match with a user from the Users database. If it isn’t then the user will be displayed with an adequate error message display what they did wrong. Otherwise, the user will be logged in to their account and taken to the landing page, ending the function.</w:t>
+        <w:drawing>
+          <wp:inline distT="0" distB="0" distL="0" distR="0" wp14:anchorId="7EB91621" wp14:editId="3645064F">
+            <wp:extent cx="4229100" cy="8858250"/>
+            <wp:effectExtent l="0" t="0" r="0" b="0"/>
+            <wp:docPr id="1973004292" name="Picture 1"/>
+            <wp:cNvGraphicFramePr>
+              <a:graphicFrameLocks xmlns:a="http://schemas.openxmlformats.org/drawingml/2006/main" noChangeAspect="1"/>
+            </wp:cNvGraphicFramePr>
+            <a:graphic xmlns:a="http://schemas.openxmlformats.org/drawingml/2006/main">
+              <a:graphicData uri="http://schemas.openxmlformats.org/drawingml/2006/picture">
+                <pic:pic xmlns:pic="http://schemas.openxmlformats.org/drawingml/2006/picture">
+                  <pic:nvPicPr>
+                    <pic:cNvPr id="0" name="Picture 1"/>
+                    <pic:cNvPicPr>
+                      <a:picLocks noChangeAspect="1" noChangeArrowheads="1"/>
+                    </pic:cNvPicPr>
+                  </pic:nvPicPr>
+                  <pic:blipFill>
+                    <a:blip r:embed="rId12">
+                      <a:extLst>
+                        <a:ext uri="{28A0092B-C50C-407E-A947-70E740481C1C}">
+                          <a14:useLocalDpi xmlns:a14="http://schemas.microsoft.com/office/drawing/2010/main" val="0"/>
+                        </a:ext>
+                      </a:extLst>
+                    </a:blip>
+                    <a:srcRect/>
+                    <a:stretch>
+                      <a:fillRect/>
+                    </a:stretch>
+                  </pic:blipFill>
+                  <pic:spPr bwMode="auto">
+                    <a:xfrm>
+                      <a:off x="0" y="0"/>
+                      <a:ext cx="4229100" cy="8858250"/>
+                    </a:xfrm>
+                    <a:prstGeom prst="rect">
+                      <a:avLst/>
+                    </a:prstGeom>
+                    <a:noFill/>
+                    <a:ln>
+                      <a:noFill/>
+                    </a:ln>
+                  </pic:spPr>
+                </pic:pic>
+              </a:graphicData>
+            </a:graphic>
+          </wp:inline>
+        </w:drawing>
+      </w:r>
+    </w:p>
+    <w:p>
+      <w:pPr>
+        <w:rPr>
+          <w:b/>
+          <w:bCs/>
+        </w:rPr>
+      </w:pPr>
+      <w:r>
+        <w:rPr>
+          <w:b/>
+          <w:bCs/>
+        </w:rPr>
+        <w:lastRenderedPageBreak/>
+        <w:t>Place Order:</w:t>
+      </w:r>
+    </w:p>
+    <w:p>
+      <w:pPr>
+        <w:rPr>
+          <w:b/>
+          <w:bCs/>
+        </w:rPr>
+      </w:pPr>
+    </w:p>
+    <w:p>
+      <w:pPr>
+        <w:rPr>
+          <w:b/>
+          <w:bCs/>
+        </w:rPr>
+      </w:pPr>
+    </w:p>
+    <w:p>
+      <w:pPr>
+        <w:rPr>
+          <w:b/>
+          <w:bCs/>
+        </w:rPr>
+      </w:pPr>
+      <w:r>
+        <w:rPr>
+          <w:b/>
+          <w:bCs/>
+          <w:noProof/>
+        </w:rPr>
+        <w:lastRenderedPageBreak/>
+        <w:drawing>
+          <wp:inline distT="0" distB="0" distL="0" distR="0" wp14:anchorId="3CA605DE" wp14:editId="53D6DA6E">
+            <wp:extent cx="5295900" cy="8858250"/>
+            <wp:effectExtent l="0" t="0" r="0" b="0"/>
+            <wp:docPr id="1514562305" name="Picture 4"/>
+            <wp:cNvGraphicFramePr>
+              <a:graphicFrameLocks xmlns:a="http://schemas.openxmlformats.org/drawingml/2006/main" noChangeAspect="1"/>
+            </wp:cNvGraphicFramePr>
+            <a:graphic xmlns:a="http://schemas.openxmlformats.org/drawingml/2006/main">
+              <a:graphicData uri="http://schemas.openxmlformats.org/drawingml/2006/picture">
+                <pic:pic xmlns:pic="http://schemas.openxmlformats.org/drawingml/2006/picture">
+                  <pic:nvPicPr>
+                    <pic:cNvPr id="0" name="Picture 9"/>
+                    <pic:cNvPicPr>
+                      <a:picLocks noChangeAspect="1" noChangeArrowheads="1"/>
+                    </pic:cNvPicPr>
+                  </pic:nvPicPr>
+                  <pic:blipFill>
+                    <a:blip r:embed="rId13">
+                      <a:extLst>
+                        <a:ext uri="{28A0092B-C50C-407E-A947-70E740481C1C}">
+                          <a14:useLocalDpi xmlns:a14="http://schemas.microsoft.com/office/drawing/2010/main" val="0"/>
+                        </a:ext>
+                      </a:extLst>
+                    </a:blip>
+                    <a:srcRect/>
+                    <a:stretch>
+                      <a:fillRect/>
+                    </a:stretch>
+                  </pic:blipFill>
+                  <pic:spPr bwMode="auto">
+                    <a:xfrm>
+                      <a:off x="0" y="0"/>
+                      <a:ext cx="5295900" cy="8858250"/>
+                    </a:xfrm>
+                    <a:prstGeom prst="rect">
+                      <a:avLst/>
+                    </a:prstGeom>
+                    <a:noFill/>
+                    <a:ln>
+                      <a:noFill/>
+                    </a:ln>
+                  </pic:spPr>
+                </pic:pic>
+              </a:graphicData>
+            </a:graphic>
+          </wp:inline>
+        </w:drawing>
+      </w:r>
+    </w:p>
+    <w:p>
+      <w:pPr>
+        <w:rPr>
+          <w:b/>
+          <w:bCs/>
+        </w:rPr>
+      </w:pPr>
+    </w:p>
+    <w:p>
+      <w:pPr>
+        <w:rPr>
+          <w:b/>
+          <w:bCs/>
+        </w:rPr>
+      </w:pPr>
+      <w:r>
+        <w:rPr>
+          <w:b/>
+          <w:bCs/>
+        </w:rPr>
+        <w:t>View Order History:</w:t>
+      </w:r>
+    </w:p>
+    <w:p>
+      <w:pPr>
+        <w:rPr>
+          <w:b/>
+          <w:bCs/>
+        </w:rPr>
+      </w:pPr>
+    </w:p>
+    <w:p>
+      <w:pPr>
+        <w:rPr>
+          <w:b/>
+          <w:bCs/>
+        </w:rPr>
+      </w:pPr>
+      <w:r>
+        <w:rPr>
+          <w:b/>
+          <w:bCs/>
+          <w:noProof/>
+        </w:rPr>
+        <w:drawing>
+          <wp:inline distT="0" distB="0" distL="0" distR="0" wp14:anchorId="3E6A999E" wp14:editId="68CDABF1">
+            <wp:extent cx="4295775" cy="6200775"/>
+            <wp:effectExtent l="0" t="0" r="9525" b="9525"/>
+            <wp:docPr id="387605185" name="Picture 5"/>
+            <wp:cNvGraphicFramePr>
+              <a:graphicFrameLocks xmlns:a="http://schemas.openxmlformats.org/drawingml/2006/main" noChangeAspect="1"/>
+            </wp:cNvGraphicFramePr>
+            <a:graphic xmlns:a="http://schemas.openxmlformats.org/drawingml/2006/main">
+              <a:graphicData uri="http://schemas.openxmlformats.org/drawingml/2006/picture">
+                <pic:pic xmlns:pic="http://schemas.openxmlformats.org/drawingml/2006/picture">
+                  <pic:nvPicPr>
+                    <pic:cNvPr id="0" name="Picture 10"/>
+                    <pic:cNvPicPr>
+                      <a:picLocks noChangeAspect="1" noChangeArrowheads="1"/>
+                    </pic:cNvPicPr>
+                  </pic:nvPicPr>
+                  <pic:blipFill>
+                    <a:blip r:embed="rId14">
+                      <a:extLst>
+                        <a:ext uri="{28A0092B-C50C-407E-A947-70E740481C1C}">
+                          <a14:useLocalDpi xmlns:a14="http://schemas.microsoft.com/office/drawing/2010/main" val="0"/>
+                        </a:ext>
+                      </a:extLst>
+                    </a:blip>
+                    <a:srcRect/>
+                    <a:stretch>
+                      <a:fillRect/>
+                    </a:stretch>
+                  </pic:blipFill>
+                  <pic:spPr bwMode="auto">
+                    <a:xfrm>
+                      <a:off x="0" y="0"/>
+                      <a:ext cx="4295775" cy="6200775"/>
+                    </a:xfrm>
+                    <a:prstGeom prst="rect">
+                      <a:avLst/>
+                    </a:prstGeom>
+                    <a:noFill/>
+                    <a:ln>
+                      <a:noFill/>
+                    </a:ln>
+                  </pic:spPr>
+                </pic:pic>
+              </a:graphicData>
+            </a:graphic>
+          </wp:inline>
+        </w:drawing>
       </w:r>
     </w:p>
     <w:p>
@@ -458,7 +790,16 @@
       </w:pPr>
       <w:r>
         <w:lastRenderedPageBreak/>
-        <w:t>MVC Design Diagram</w:t>
+        <w:t xml:space="preserve">ASP.NET </w:t>
+      </w:r>
+      <w:r>
+        <w:t xml:space="preserve">MVC </w:t>
+      </w:r>
+      <w:r>
+        <w:t xml:space="preserve">Database </w:t>
+      </w:r>
+      <w:r>
+        <w:t>Design Diagram</w:t>
       </w:r>
     </w:p>
     <w:p>
@@ -484,7 +825,7 @@
                     </pic:cNvPicPr>
                   </pic:nvPicPr>
                   <pic:blipFill>
-                    <a:blip r:embed="rId11">
+                    <a:blip r:embed="rId15">
                       <a:extLst>
                         <a:ext uri="{28A0092B-C50C-407E-A947-70E740481C1C}">
                           <a14:useLocalDpi xmlns:a14="http://schemas.microsoft.com/office/drawing/2010/main" val="0"/>
@@ -516,6 +857,77 @@
         </w:drawing>
       </w:r>
     </w:p>
+    <w:p/>
+    <w:p>
+      <w:pPr>
+        <w:pStyle w:val="Heading2"/>
+      </w:pPr>
+      <w:r>
+        <w:lastRenderedPageBreak/>
+        <w:t>Greenfield Local Hub Database Design Diagram</w:t>
+      </w:r>
+    </w:p>
+    <w:p>
+      <w:r>
+        <w:rPr>
+          <w:noProof/>
+        </w:rPr>
+        <w:drawing>
+          <wp:inline distT="0" distB="0" distL="0" distR="0" wp14:anchorId="53D55F95" wp14:editId="328C1C6B">
+            <wp:extent cx="5734050" cy="5467350"/>
+            <wp:effectExtent l="0" t="0" r="0" b="0"/>
+            <wp:docPr id="1318976813" name="Picture 6"/>
+            <wp:cNvGraphicFramePr>
+              <a:graphicFrameLocks xmlns:a="http://schemas.openxmlformats.org/drawingml/2006/main" noChangeAspect="1"/>
+            </wp:cNvGraphicFramePr>
+            <a:graphic xmlns:a="http://schemas.openxmlformats.org/drawingml/2006/main">
+              <a:graphicData uri="http://schemas.openxmlformats.org/drawingml/2006/picture">
+                <pic:pic xmlns:pic="http://schemas.openxmlformats.org/drawingml/2006/picture">
+                  <pic:nvPicPr>
+                    <pic:cNvPr id="0" name="Picture 11"/>
+                    <pic:cNvPicPr>
+                      <a:picLocks noChangeAspect="1" noChangeArrowheads="1"/>
+                    </pic:cNvPicPr>
+                  </pic:nvPicPr>
+                  <pic:blipFill>
+                    <a:blip r:embed="rId16">
+                      <a:extLst>
+                        <a:ext uri="{28A0092B-C50C-407E-A947-70E740481C1C}">
+                          <a14:useLocalDpi xmlns:a14="http://schemas.microsoft.com/office/drawing/2010/main" val="0"/>
+                        </a:ext>
+                      </a:extLst>
+                    </a:blip>
+                    <a:srcRect/>
+                    <a:stretch>
+                      <a:fillRect/>
+                    </a:stretch>
+                  </pic:blipFill>
+                  <pic:spPr bwMode="auto">
+                    <a:xfrm>
+                      <a:off x="0" y="0"/>
+                      <a:ext cx="5734050" cy="5467350"/>
+                    </a:xfrm>
+                    <a:prstGeom prst="rect">
+                      <a:avLst/>
+                    </a:prstGeom>
+                    <a:noFill/>
+                    <a:ln>
+                      <a:noFill/>
+                    </a:ln>
+                  </pic:spPr>
+                </pic:pic>
+              </a:graphicData>
+            </a:graphic>
+          </wp:inline>
+        </w:drawing>
+      </w:r>
+    </w:p>
+    <w:p/>
+    <w:p>
+      <w:pPr>
+        <w:pStyle w:val="Heading2"/>
+      </w:pPr>
+    </w:p>
     <w:p>
       <w:pPr>
         <w:pStyle w:val="Heading2"/>
@@ -767,21 +1179,16 @@
           </w:tcPr>
           <w:p>
             <w:r>
-              <w:t xml:space="preserve">References the role associated </w:t>
-            </w:r>
-            <w:r>
-              <w:lastRenderedPageBreak/>
-              <w:t>with the claim.</w:t>
-            </w:r>
-          </w:p>
-        </w:tc>
-        <w:tc>
-          <w:tcPr>
-            <w:tcW w:w="1503" w:type="dxa"/>
-          </w:tcPr>
-          <w:p>
-            <w:r>
-              <w:lastRenderedPageBreak/>
+              <w:t>References the role associated with the claim.</w:t>
+            </w:r>
+          </w:p>
+        </w:tc>
+        <w:tc>
+          <w:tcPr>
+            <w:tcW w:w="1503" w:type="dxa"/>
+          </w:tcPr>
+          <w:p>
+            <w:r>
               <w:t>FK</w:t>
             </w:r>
           </w:p>
@@ -815,6 +1222,7 @@
           <w:p>
             <w:proofErr w:type="spellStart"/>
             <w:r>
+              <w:lastRenderedPageBreak/>
               <w:t>ClaimType</w:t>
             </w:r>
             <w:proofErr w:type="spellEnd"/>
@@ -1709,7 +2117,6 @@
           <w:p>
             <w:proofErr w:type="spellStart"/>
             <w:r>
-              <w:lastRenderedPageBreak/>
               <w:t>ClaimValue</w:t>
             </w:r>
             <w:proofErr w:type="spellEnd"/>
@@ -1926,11 +2333,9 @@
             <w:tcW w:w="1502" w:type="dxa"/>
           </w:tcPr>
           <w:p>
-            <w:proofErr w:type="spellStart"/>
             <w:r>
               <w:t>LoginProvider</w:t>
             </w:r>
-            <w:proofErr w:type="spellEnd"/>
           </w:p>
         </w:tc>
         <w:tc>
@@ -2161,10 +2566,7 @@
           </w:tcPr>
           <w:p>
             <w:r>
-              <w:t xml:space="preserve">50 </w:t>
-            </w:r>
-            <w:r>
-              <w:t>characters</w:t>
+              <w:t>50 characters</w:t>
             </w:r>
           </w:p>
         </w:tc>
@@ -2382,10 +2784,7 @@
           </w:tcPr>
           <w:p>
             <w:r>
-              <w:t xml:space="preserve">50 </w:t>
-            </w:r>
-            <w:r>
-              <w:t>characters</w:t>
+              <w:t>50 characters</w:t>
             </w:r>
           </w:p>
         </w:tc>
@@ -2449,10 +2848,7 @@
           </w:tcPr>
           <w:p>
             <w:r>
-              <w:t xml:space="preserve">50 </w:t>
-            </w:r>
-            <w:r>
-              <w:t>characters</w:t>
+              <w:t>50 characters</w:t>
             </w:r>
           </w:p>
         </w:tc>
@@ -2486,12 +2882,12 @@
         <w:tblLook w:val="04A0" w:firstRow="1" w:lastRow="0" w:firstColumn="1" w:lastColumn="0" w:noHBand="0" w:noVBand="1"/>
       </w:tblPr>
       <w:tblGrid>
-        <w:gridCol w:w="2467"/>
-        <w:gridCol w:w="1815"/>
-        <w:gridCol w:w="1530"/>
-        <w:gridCol w:w="860"/>
-        <w:gridCol w:w="1151"/>
-        <w:gridCol w:w="1193"/>
+        <w:gridCol w:w="1297"/>
+        <w:gridCol w:w="985"/>
+        <w:gridCol w:w="848"/>
+        <w:gridCol w:w="4556"/>
+        <w:gridCol w:w="665"/>
+        <w:gridCol w:w="665"/>
       </w:tblGrid>
       <w:tr>
         <w:tc>
@@ -2628,6 +3024,7 @@
           </w:tcPr>
           <w:p>
             <w:r>
+              <w:lastRenderedPageBreak/>
               <w:t>Id</w:t>
             </w:r>
           </w:p>
@@ -2658,6 +3055,59 @@
           </w:tcPr>
           <w:p>
             <w:r>
+              <w:rPr>
+                <w:noProof/>
+              </w:rPr>
+              <w:drawing>
+                <wp:inline distT="0" distB="0" distL="0" distR="0" wp14:anchorId="1F81373F" wp14:editId="309E654A">
+                  <wp:extent cx="5724525" cy="1590675"/>
+                  <wp:effectExtent l="0" t="0" r="9525" b="9525"/>
+                  <wp:docPr id="968040237" name="Picture 1"/>
+                  <wp:cNvGraphicFramePr>
+                    <a:graphicFrameLocks xmlns:a="http://schemas.openxmlformats.org/drawingml/2006/main" noChangeAspect="1"/>
+                  </wp:cNvGraphicFramePr>
+                  <a:graphic xmlns:a="http://schemas.openxmlformats.org/drawingml/2006/main">
+                    <a:graphicData uri="http://schemas.openxmlformats.org/drawingml/2006/picture">
+                      <pic:pic xmlns:pic="http://schemas.openxmlformats.org/drawingml/2006/picture">
+                        <pic:nvPicPr>
+                          <pic:cNvPr id="0" name="Picture 1"/>
+                          <pic:cNvPicPr>
+                            <a:picLocks noChangeAspect="1" noChangeArrowheads="1"/>
+                          </pic:cNvPicPr>
+                        </pic:nvPicPr>
+                        <pic:blipFill>
+                          <a:blip r:embed="rId8" cstate="print">
+                            <a:extLst>
+                              <a:ext uri="{28A0092B-C50C-407E-A947-70E740481C1C}">
+                                <a14:useLocalDpi xmlns:a14="http://schemas.microsoft.com/office/drawing/2010/main" val="0"/>
+                              </a:ext>
+                            </a:extLst>
+                          </a:blip>
+                          <a:srcRect/>
+                          <a:stretch>
+                            <a:fillRect/>
+                          </a:stretch>
+                        </pic:blipFill>
+                        <pic:spPr bwMode="auto">
+                          <a:xfrm>
+                            <a:off x="0" y="0"/>
+                            <a:ext cx="5724525" cy="1590675"/>
+                          </a:xfrm>
+                          <a:prstGeom prst="rect">
+                            <a:avLst/>
+                          </a:prstGeom>
+                          <a:noFill/>
+                          <a:ln>
+                            <a:noFill/>
+                          </a:ln>
+                        </pic:spPr>
+                      </pic:pic>
+                    </a:graphicData>
+                  </a:graphic>
+                </wp:inline>
+              </w:drawing>
+            </w:r>
+            <w:r>
               <w:t>PK</w:t>
             </w:r>
           </w:p>
@@ -2668,10 +3118,7 @@
           </w:tcPr>
           <w:p>
             <w:r>
-              <w:t xml:space="preserve">50 </w:t>
-            </w:r>
-            <w:r>
-              <w:t>characters</w:t>
+              <w:t>50 characters</w:t>
             </w:r>
           </w:p>
         </w:tc>
@@ -2740,10 +3187,7 @@
           </w:tcPr>
           <w:p>
             <w:r>
-              <w:t xml:space="preserve">50 </w:t>
-            </w:r>
-            <w:r>
-              <w:t>characters</w:t>
+              <w:t>50 characters</w:t>
             </w:r>
           </w:p>
         </w:tc>
@@ -2766,7 +3210,6 @@
           <w:p>
             <w:proofErr w:type="spellStart"/>
             <w:r>
-              <w:lastRenderedPageBreak/>
               <w:t>NormalizedUserName</w:t>
             </w:r>
             <w:proofErr w:type="spellEnd"/>
@@ -2813,10 +3256,7 @@
           </w:tcPr>
           <w:p>
             <w:r>
-              <w:t xml:space="preserve">50 </w:t>
-            </w:r>
-            <w:r>
-              <w:t>characters</w:t>
+              <w:t>50 characters</w:t>
             </w:r>
           </w:p>
         </w:tc>
@@ -2878,10 +3318,7 @@
           </w:tcPr>
           <w:p>
             <w:r>
-              <w:t xml:space="preserve">100 </w:t>
-            </w:r>
-            <w:r>
-              <w:t>characters</w:t>
+              <w:t>100 characters</w:t>
             </w:r>
           </w:p>
         </w:tc>
@@ -2950,10 +3387,7 @@
           </w:tcPr>
           <w:p>
             <w:r>
-              <w:t xml:space="preserve">100 </w:t>
-            </w:r>
-            <w:r>
-              <w:t>characters</w:t>
+              <w:t>100 characters</w:t>
             </w:r>
           </w:p>
         </w:tc>
@@ -2997,7 +3431,11 @@
           </w:tcPr>
           <w:p>
             <w:r>
-              <w:t>Indicates whether the user has confirmed their email address</w:t>
+              <w:t xml:space="preserve">Indicates whether the user has confirmed their email </w:t>
+            </w:r>
+            <w:r>
+              <w:lastRenderedPageBreak/>
+              <w:t>address</w:t>
             </w:r>
           </w:p>
         </w:tc>
@@ -3007,6 +3445,7 @@
           </w:tcPr>
           <w:p>
             <w:r>
+              <w:lastRenderedPageBreak/>
               <w:t>N/A</w:t>
             </w:r>
           </w:p>
@@ -3081,10 +3520,7 @@
           </w:tcPr>
           <w:p>
             <w:r>
-              <w:t xml:space="preserve">255 </w:t>
-            </w:r>
-            <w:r>
-              <w:t>characters</w:t>
+              <w:t>255 characters</w:t>
             </w:r>
           </w:p>
         </w:tc>
@@ -3148,10 +3584,7 @@
           </w:tcPr>
           <w:p>
             <w:r>
-              <w:t xml:space="preserve">100 </w:t>
-            </w:r>
-            <w:r>
-              <w:t>characters</w:t>
+              <w:t>100 characters</w:t>
             </w:r>
           </w:p>
         </w:tc>
@@ -3215,10 +3648,7 @@
           </w:tcPr>
           <w:p>
             <w:r>
-              <w:t xml:space="preserve">100 </w:t>
-            </w:r>
-            <w:r>
-              <w:t>characters</w:t>
+              <w:t>100 characters</w:t>
             </w:r>
           </w:p>
         </w:tc>
@@ -3282,10 +3712,7 @@
           </w:tcPr>
           <w:p>
             <w:r>
-              <w:t xml:space="preserve">20 </w:t>
-            </w:r>
-            <w:r>
-              <w:t>characters</w:t>
+              <w:t>20 characters</w:t>
             </w:r>
           </w:p>
         </w:tc>
@@ -3393,7 +3820,11 @@
           </w:tcPr>
           <w:p>
             <w:r>
-              <w:t>Indicates whether or not two factor authentication has been enabled</w:t>
+              <w:t xml:space="preserve">Indicates </w:t>
+            </w:r>
+            <w:r>
+              <w:lastRenderedPageBreak/>
+              <w:t>whether or not two factor authentication has been enabled</w:t>
             </w:r>
           </w:p>
         </w:tc>
@@ -3403,6 +3834,7 @@
           </w:tcPr>
           <w:p>
             <w:r>
+              <w:lastRenderedPageBreak/>
               <w:t>N/A</w:t>
             </w:r>
           </w:p>
@@ -3500,7 +3932,6 @@
           <w:p>
             <w:proofErr w:type="spellStart"/>
             <w:r>
-              <w:lastRenderedPageBreak/>
               <w:t>LockoutEnabled</w:t>
             </w:r>
             <w:proofErr w:type="spellEnd"/>
@@ -3831,10 +4262,7 @@
           </w:tcPr>
           <w:p>
             <w:r>
-              <w:t xml:space="preserve">50 </w:t>
-            </w:r>
-            <w:r>
-              <w:t>characters</w:t>
+              <w:t>50 characters</w:t>
             </w:r>
           </w:p>
         </w:tc>
@@ -3855,11 +4283,9 @@
             <w:tcW w:w="1501" w:type="dxa"/>
           </w:tcPr>
           <w:p>
-            <w:proofErr w:type="spellStart"/>
             <w:r>
               <w:t>LoginProvider</w:t>
             </w:r>
-            <w:proofErr w:type="spellEnd"/>
           </w:p>
         </w:tc>
         <w:tc>
@@ -3878,7 +4304,11 @@
           </w:tcPr>
           <w:p>
             <w:r>
-              <w:t>Identifies the authentication provider which is associated with the token</w:t>
+              <w:t xml:space="preserve">Identifies the authentication provider which is </w:t>
+            </w:r>
+            <w:r>
+              <w:lastRenderedPageBreak/>
+              <w:t>associated with the token</w:t>
             </w:r>
           </w:p>
         </w:tc>
@@ -3888,6 +4318,7 @@
           </w:tcPr>
           <w:p>
             <w:r>
+              <w:lastRenderedPageBreak/>
               <w:t>PK</w:t>
             </w:r>
           </w:p>
@@ -3898,10 +4329,7 @@
           </w:tcPr>
           <w:p>
             <w:r>
-              <w:t xml:space="preserve">50 </w:t>
-            </w:r>
-            <w:r>
-              <w:t>characters</w:t>
+              <w:t>50 characters</w:t>
             </w:r>
           </w:p>
         </w:tc>
@@ -3963,10 +4391,7 @@
           </w:tcPr>
           <w:p>
             <w:r>
-              <w:t xml:space="preserve">50 </w:t>
-            </w:r>
-            <w:r>
-              <w:t>characters</w:t>
+              <w:t>50 characters</w:t>
             </w:r>
           </w:p>
         </w:tc>
@@ -4028,10 +4453,7 @@
           </w:tcPr>
           <w:p>
             <w:r>
-              <w:t xml:space="preserve">255 </w:t>
-            </w:r>
-            <w:r>
-              <w:t>characters</w:t>
+              <w:t>255 characters</w:t>
             </w:r>
           </w:p>
         </w:tc>
@@ -4111,15 +4533,7 @@
         </w:numPr>
       </w:pPr>
       <w:r>
-        <w:t xml:space="preserve">Name of the Model – </w:t>
-      </w:r>
-      <w:proofErr w:type="gramStart"/>
-      <w:r>
-        <w:t>e.g.</w:t>
-      </w:r>
-      <w:proofErr w:type="gramEnd"/>
-      <w:r>
-        <w:t xml:space="preserve"> Environment, User</w:t>
+        <w:t>Name of the Model – e.g. Environment, User</w:t>
       </w:r>
     </w:p>
     <w:p>
@@ -4155,7 +4569,6 @@
         </w:numPr>
       </w:pPr>
       <w:r>
-        <w:lastRenderedPageBreak/>
         <w:t>At the end of each table, justify why you are using the particular model and why that set of data is needed to be stored</w:t>
       </w:r>
     </w:p>
@@ -4503,7 +4916,7 @@
 </file>
 
 <file path=word/numbering.xml><?xml version="1.0" encoding="utf-8"?>
-<w:numbering xmlns:wpc="http://schemas.microsoft.com/office/word/2010/wordprocessingCanvas" xmlns:cx="http://schemas.microsoft.com/office/drawing/2014/chartex" xmlns:cx1="http://schemas.microsoft.com/office/drawing/2015/9/8/chartex" xmlns:cx2="http://schemas.microsoft.com/office/drawing/2015/10/21/chartex" xmlns:cx3="http://schemas.microsoft.com/office/drawing/2016/5/9/chartex" xmlns:cx4="http://schemas.microsoft.com/office/drawing/2016/5/10/chartex" xmlns:cx5="http://schemas.microsoft.com/office/drawing/2016/5/11/chartex" xmlns:cx6="http://schemas.microsoft.com/office/drawing/2016/5/12/chartex" xmlns:cx7="http://schemas.microsoft.com/office/drawing/2016/5/13/chartex" xmlns:cx8="http://schemas.microsoft.com/office/drawing/2016/5/14/chartex" xmlns:mc="http://schemas.openxmlformats.org/markup-compatibility/2006" xmlns:aink="http://schemas.microsoft.com/office/drawing/2016/ink" xmlns:am3d="http://schemas.microsoft.com/office/drawing/2017/model3d" xmlns:o="urn:schemas-microsoft-com:office:office" xmlns:r="http://schemas.openxmlformats.org/officeDocument/2006/relationships" xmlns:m="http://schemas.openxmlformats.org/officeDocument/2006/math" xmlns:v="urn:schemas-microsoft-com:vml" xmlns:wp14="http://schemas.microsoft.com/office/word/2010/wordprocessingDrawing" xmlns:wp="http://schemas.openxmlformats.org/drawingml/2006/wordprocessingDrawing" xmlns:w10="urn:schemas-microsoft-com:office:word" xmlns:w="http://schemas.openxmlformats.org/wordprocessingml/2006/main" xmlns:w14="http://schemas.microsoft.com/office/word/2010/wordml" xmlns:w15="http://schemas.microsoft.com/office/word/2012/wordml" xmlns:w16cex="http://schemas.microsoft.com/office/word/2018/wordml/cex" xmlns:w16cid="http://schemas.microsoft.com/office/word/2016/wordml/cid" xmlns:w16="http://schemas.microsoft.com/office/word/2018/wordml" xmlns:w16sdtdh="http://schemas.microsoft.com/office/word/2020/wordml/sdtdatahash" xmlns:w16se="http://schemas.microsoft.com/office/word/2015/wordml/symex" xmlns:wpg="http://schemas.microsoft.com/office/word/2010/wordprocessingGroup" xmlns:wpi="http://schemas.microsoft.com/office/word/2010/wordprocessingInk" xmlns:wne="http://schemas.microsoft.com/office/word/2006/wordml" xmlns:wps="http://schemas.microsoft.com/office/word/2010/wordprocessingShape" mc:Ignorable="w14 w15 w16se w16cid w16 w16cex w16sdtdh wp14">
+<w:numbering xmlns:wpc="http://schemas.microsoft.com/office/word/2010/wordprocessingCanvas" xmlns:cx="http://schemas.microsoft.com/office/drawing/2014/chartex" xmlns:cx1="http://schemas.microsoft.com/office/drawing/2015/9/8/chartex" xmlns:cx2="http://schemas.microsoft.com/office/drawing/2015/10/21/chartex" xmlns:cx3="http://schemas.microsoft.com/office/drawing/2016/5/9/chartex" xmlns:cx4="http://schemas.microsoft.com/office/drawing/2016/5/10/chartex" xmlns:cx5="http://schemas.microsoft.com/office/drawing/2016/5/11/chartex" xmlns:cx6="http://schemas.microsoft.com/office/drawing/2016/5/12/chartex" xmlns:cx7="http://schemas.microsoft.com/office/drawing/2016/5/13/chartex" xmlns:cx8="http://schemas.microsoft.com/office/drawing/2016/5/14/chartex" xmlns:mc="http://schemas.openxmlformats.org/markup-compatibility/2006" xmlns:aink="http://schemas.microsoft.com/office/drawing/2016/ink" xmlns:am3d="http://schemas.microsoft.com/office/drawing/2017/model3d" xmlns:o="urn:schemas-microsoft-com:office:office" xmlns:oel="http://schemas.microsoft.com/office/2019/extlst" xmlns:r="http://schemas.openxmlformats.org/officeDocument/2006/relationships" xmlns:m="http://schemas.openxmlformats.org/officeDocument/2006/math" xmlns:v="urn:schemas-microsoft-com:vml" xmlns:wp14="http://schemas.microsoft.com/office/word/2010/wordprocessingDrawing" xmlns:wp="http://schemas.openxmlformats.org/drawingml/2006/wordprocessingDrawing" xmlns:w10="urn:schemas-microsoft-com:office:word" xmlns:w="http://schemas.openxmlformats.org/wordprocessingml/2006/main" xmlns:w14="http://schemas.microsoft.com/office/word/2010/wordml" xmlns:w15="http://schemas.microsoft.com/office/word/2012/wordml" xmlns:w16cex="http://schemas.microsoft.com/office/word/2018/wordml/cex" xmlns:w16cid="http://schemas.microsoft.com/office/word/2016/wordml/cid" xmlns:w16="http://schemas.microsoft.com/office/word/2018/wordml" xmlns:w16du="http://schemas.microsoft.com/office/word/2023/wordml/word16du" xmlns:w16sdtdh="http://schemas.microsoft.com/office/word/2020/wordml/sdtdatahash" xmlns:w16sdtfl="http://schemas.microsoft.com/office/word/2024/wordml/sdtformatlock" xmlns:w16se="http://schemas.microsoft.com/office/word/2015/wordml/symex" xmlns:wpg="http://schemas.microsoft.com/office/word/2010/wordprocessingGroup" xmlns:wpi="http://schemas.microsoft.com/office/word/2010/wordprocessingInk" xmlns:wne="http://schemas.microsoft.com/office/word/2006/wordml" xmlns:wps="http://schemas.microsoft.com/office/word/2010/wordprocessingShape" mc:Ignorable="w14 w15 w16se w16cid w16 w16cex w16sdtdh w16sdtfl w16du wp14">
   <w:abstractNum w:abstractNumId="0" w15:restartNumberingAfterBreak="0">
     <w:nsid w:val="32860D74"/>
     <w:multiLevelType w:val="hybridMultilevel"/>
@@ -4705,17 +5118,17 @@
       </w:pPr>
     </w:lvl>
   </w:abstractNum>
-  <w:num w:numId="1">
+  <w:num w:numId="1" w16cid:durableId="508835889">
     <w:abstractNumId w:val="0"/>
   </w:num>
-  <w:num w:numId="2">
+  <w:num w:numId="2" w16cid:durableId="2073698783">
     <w:abstractNumId w:val="1"/>
   </w:num>
 </w:numbering>
 </file>
 
 <file path=word/styles.xml><?xml version="1.0" encoding="utf-8"?>
-<w:styles xmlns:mc="http://schemas.openxmlformats.org/markup-compatibility/2006" xmlns:r="http://schemas.openxmlformats.org/officeDocument/2006/relationships" xmlns:w="http://schemas.openxmlformats.org/wordprocessingml/2006/main" xmlns:w14="http://schemas.microsoft.com/office/word/2010/wordml" xmlns:w15="http://schemas.microsoft.com/office/word/2012/wordml" xmlns:w16cex="http://schemas.microsoft.com/office/word/2018/wordml/cex" xmlns:w16cid="http://schemas.microsoft.com/office/word/2016/wordml/cid" xmlns:w16="http://schemas.microsoft.com/office/word/2018/wordml" xmlns:w16sdtdh="http://schemas.microsoft.com/office/word/2020/wordml/sdtdatahash" xmlns:w16se="http://schemas.microsoft.com/office/word/2015/wordml/symex" mc:Ignorable="w14 w15 w16se w16cid w16 w16cex w16sdtdh">
+<w:styles xmlns:mc="http://schemas.openxmlformats.org/markup-compatibility/2006" xmlns:r="http://schemas.openxmlformats.org/officeDocument/2006/relationships" xmlns:w="http://schemas.openxmlformats.org/wordprocessingml/2006/main" xmlns:w14="http://schemas.microsoft.com/office/word/2010/wordml" xmlns:w15="http://schemas.microsoft.com/office/word/2012/wordml" xmlns:w16cex="http://schemas.microsoft.com/office/word/2018/wordml/cex" xmlns:w16cid="http://schemas.microsoft.com/office/word/2016/wordml/cid" xmlns:w16="http://schemas.microsoft.com/office/word/2018/wordml" xmlns:w16du="http://schemas.microsoft.com/office/word/2023/wordml/word16du" xmlns:w16sdtdh="http://schemas.microsoft.com/office/word/2020/wordml/sdtdatahash" xmlns:w16sdtfl="http://schemas.microsoft.com/office/word/2024/wordml/sdtformatlock" xmlns:w16se="http://schemas.microsoft.com/office/word/2015/wordml/symex" mc:Ignorable="w14 w15 w16se w16cid w16 w16cex w16sdtdh w16sdtfl w16du">
   <w:docDefaults>
     <w:rPrDefault>
       <w:rPr>

</xml_diff>